<commit_message>
updated prd and added claude prompt to index
</commit_message>
<xml_diff>
--- a/cultivate/Cultivate_PRD.docx
+++ b/cultivate/Cultivate_PRD.docx
@@ -3581,7 +3581,7 @@
                 <w:sz w:val="19"/>
                 <w:szCs w:val="19"/>
               </w:rPr>
-              <w:t xml:space="preserve">AI_Resources_Hub.html</w:t>
+              <w:t xml:space="preserve">index.html</w:t>
             </w:r>
           </w:p>
         </w:tc>
@@ -4256,6 +4256,156 @@
                 <w:szCs w:val="19"/>
               </w:rPr>
               <w:t xml:space="preserve">Tool stack cards, vocabulary reference, practice projects, newsletters</w:t>
+            </w:r>
+          </w:p>
+        </w:tc>
+      </w:tr>
+      <w:tr>
+        <w:tc>
+          <w:tcPr>
+            <w:tcW w:type="dxa" w:w="1200"/>
+            <w:tcBorders>
+              <w:top w:val="single" w:color="ddd3c8" w:sz="1"/>
+              <w:left w:val="single" w:color="ddd3c8" w:sz="1"/>
+              <w:bottom w:val="single" w:color="ddd3c8" w:sz="1"/>
+              <w:right w:val="single" w:color="ddd3c8" w:sz="1"/>
+            </w:tcBorders>
+            <w:shd w:fill="ede4f2" w:val="clear"/>
+            <w:tcMar>
+              <w:top w:type="dxa" w:w="80"/>
+              <w:left w:type="dxa" w:w="140"/>
+              <w:bottom w:type="dxa" w:w="80"/>
+              <w:right w:type="dxa" w:w="140"/>
+            </w:tcMar>
+          </w:tcPr>
+          <w:p>
+            <w:pPr>
+              <w:spacing w:before="0" w:after="0"/>
+              <w:jc w:val="left"/>
+            </w:pPr>
+            <w:r>
+              <w:rPr>
+                <w:rFonts w:ascii="Arial" w:cs="Arial" w:eastAsia="Arial" w:hAnsi="Arial"/>
+                <w:b/>
+                <w:bCs/>
+                <w:i w:val="false"/>
+                <w:iCs w:val="false"/>
+                <w:color w:val="5c3a63"/>
+                <w:sz w:val="19"/>
+                <w:szCs w:val="19"/>
+              </w:rPr>
+              <w:t xml:space="preserve">Claude Context Prompt</w:t>
+            </w:r>
+          </w:p>
+        </w:tc>
+        <w:tc>
+          <w:tcPr>
+            <w:tcW w:type="dxa" w:w="1200"/>
+            <w:tcBorders>
+              <w:top w:val="single" w:color="ddd3c8" w:sz="1"/>
+              <w:left w:val="single" w:color="ddd3c8" w:sz="1"/>
+              <w:bottom w:val="single" w:color="ddd3c8" w:sz="1"/>
+              <w:right w:val="single" w:color="ddd3c8" w:sz="1"/>
+            </w:tcBorders>
+            <w:shd w:fill="FFFFFF" w:val="clear"/>
+            <w:tcMar>
+              <w:top w:type="dxa" w:w="80"/>
+              <w:left w:type="dxa" w:w="140"/>
+              <w:bottom w:type="dxa" w:w="80"/>
+              <w:right w:type="dxa" w:w="140"/>
+            </w:tcMar>
+          </w:tcPr>
+          <w:p>
+            <w:pPr>
+              <w:spacing w:before="0" w:after="0"/>
+              <w:jc w:val="left"/>
+            </w:pPr>
+            <w:r>
+              <w:rPr>
+                <w:rFonts w:ascii="Arial" w:cs="Arial" w:eastAsia="Arial" w:hAnsi="Arial"/>
+                <w:b/>
+                <w:bCs/>
+                <w:i w:val="false"/>
+                <w:iCs w:val="false"/>
+                <w:color w:val="3a2e3f"/>
+                <w:sz w:val="19"/>
+                <w:szCs w:val="19"/>
+              </w:rPr>
+              <w:t xml:space="preserve">Footer of index.html</w:t>
+            </w:r>
+          </w:p>
+        </w:tc>
+        <w:tc>
+          <w:tcPr>
+            <w:tcW w:type="dxa" w:w="2200"/>
+            <w:tcBorders>
+              <w:top w:val="single" w:color="ddd3c8" w:sz="1"/>
+              <w:left w:val="single" w:color="ddd3c8" w:sz="1"/>
+              <w:bottom w:val="single" w:color="ddd3c8" w:sz="1"/>
+              <w:right w:val="single" w:color="ddd3c8" w:sz="1"/>
+            </w:tcBorders>
+            <w:shd w:fill="FFFFFF" w:val="clear"/>
+            <w:tcMar>
+              <w:top w:type="dxa" w:w="80"/>
+              <w:left w:type="dxa" w:w="140"/>
+              <w:bottom w:type="dxa" w:w="80"/>
+              <w:right w:type="dxa" w:w="140"/>
+            </w:tcMar>
+          </w:tcPr>
+          <w:p>
+            <w:pPr>
+              <w:spacing w:before="0" w:after="0"/>
+              <w:jc w:val="left"/>
+            </w:pPr>
+            <w:r>
+              <w:rPr>
+                <w:rFonts w:ascii="Arial" w:cs="Arial" w:eastAsia="Arial" w:hAnsi="Arial"/>
+                <w:b/>
+                <w:bCs/>
+                <w:i w:val="false"/>
+                <w:iCs w:val="false"/>
+                <w:color w:val="3a2e3f"/>
+                <w:sz w:val="19"/>
+                <w:szCs w:val="19"/>
+              </w:rPr>
+              <w:t xml:space="preserve">Collapsible prompt block in the page footer. One-tap copy button. Paste into a new Claude chat to restore full project context without re-explaining tools, goals, preferences, and design system.</w:t>
+            </w:r>
+          </w:p>
+        </w:tc>
+        <w:tc>
+          <w:tcPr>
+            <w:tcW w:type="dxa" w:w="3160"/>
+            <w:tcBorders>
+              <w:top w:val="single" w:color="ddd3c8" w:sz="1"/>
+              <w:left w:val="single" w:color="ddd3c8" w:sz="1"/>
+              <w:bottom w:val="single" w:color="ddd3c8" w:sz="1"/>
+              <w:right w:val="single" w:color="ddd3c8" w:sz="1"/>
+            </w:tcBorders>
+            <w:shd w:fill="FFFFFF" w:val="clear"/>
+            <w:tcMar>
+              <w:top w:type="dxa" w:w="80"/>
+              <w:left w:type="dxa" w:w="140"/>
+              <w:bottom w:type="dxa" w:w="80"/>
+              <w:right w:type="dxa" w:w="140"/>
+            </w:tcMar>
+          </w:tcPr>
+          <w:p>
+            <w:pPr>
+              <w:spacing w:before="0" w:after="0"/>
+              <w:jc w:val="left"/>
+            </w:pPr>
+            <w:r>
+              <w:rPr>
+                <w:rFonts w:ascii="Arial" w:cs="Arial" w:eastAsia="Arial" w:hAnsi="Arial"/>
+                <w:b/>
+                <w:bCs/>
+                <w:i w:val="false"/>
+                <w:iCs w:val="false"/>
+                <w:color w:val="3a2e3f"/>
+                <w:sz w:val="19"/>
+                <w:szCs w:val="19"/>
+              </w:rPr>
+              <w:t xml:space="preserve">Collapsible toggle + copy button</w:t>
             </w:r>
           </w:p>
         </w:tc>
@@ -7258,6 +7408,119 @@
           </w:p>
         </w:tc>
       </w:tr>
+      <w:tr>
+        <w:tc>
+          <w:tcPr>
+            <w:tcW w:type="dxa" w:w="4000"/>
+            <w:tcBorders>
+              <w:top w:val="single" w:color="ddd3c8" w:sz="1"/>
+              <w:left w:val="single" w:color="ddd3c8" w:sz="1"/>
+              <w:bottom w:val="single" w:color="ddd3c8" w:sz="1"/>
+              <w:right w:val="single" w:color="ddd3c8" w:sz="1"/>
+            </w:tcBorders>
+            <w:shd w:fill="ede4f2" w:val="clear"/>
+            <w:tcMar>
+              <w:top w:type="dxa" w:w="80"/>
+              <w:left w:type="dxa" w:w="140"/>
+              <w:bottom w:type="dxa" w:w="80"/>
+              <w:right w:type="dxa" w:w="140"/>
+            </w:tcMar>
+          </w:tcPr>
+          <w:p>
+            <w:pPr>
+              <w:spacing w:before="0" w:after="0"/>
+              <w:jc w:val="left"/>
+            </w:pPr>
+            <w:r>
+              <w:rPr>
+                <w:rFonts w:ascii="Arial" w:cs="Arial" w:eastAsia="Arial" w:hAnsi="Arial"/>
+                <w:b/>
+                <w:bCs/>
+                <w:i w:val="false"/>
+                <w:iCs w:val="false"/>
+                <w:color w:val="5c3a63"/>
+                <w:sz w:val="19"/>
+                <w:szCs w:val="19"/>
+              </w:rPr>
+              <w:t xml:space="preserve">Should Cultivate support a quick-save bookmarking feature for resources found mid-session?</w:t>
+            </w:r>
+          </w:p>
+        </w:tc>
+        <w:tc>
+          <w:tcPr>
+            <w:tcW w:type="dxa" w:w="1200"/>
+            <w:tcBorders>
+              <w:top w:val="single" w:color="ddd3c8" w:sz="1"/>
+              <w:left w:val="single" w:color="ddd3c8" w:sz="1"/>
+              <w:bottom w:val="single" w:color="ddd3c8" w:sz="1"/>
+              <w:right w:val="single" w:color="ddd3c8" w:sz="1"/>
+            </w:tcBorders>
+            <w:shd w:fill="fdf3e7" w:val="clear"/>
+            <w:tcMar>
+              <w:top w:type="dxa" w:w="80"/>
+              <w:left w:type="dxa" w:w="140"/>
+              <w:bottom w:type="dxa" w:w="80"/>
+              <w:right w:type="dxa" w:w="140"/>
+            </w:tcMar>
+          </w:tcPr>
+          <w:p>
+            <w:pPr>
+              <w:spacing w:before="0" w:after="0"/>
+              <w:jc w:val="left"/>
+            </w:pPr>
+            <w:r>
+              <w:rPr>
+                <w:rFonts w:ascii="Arial" w:cs="Arial" w:eastAsia="Arial" w:hAnsi="Arial"/>
+                <w:b/>
+                <w:bCs/>
+                <w:i w:val="false"/>
+                <w:iCs w:val="false"/>
+                <w:color w:val="b8956a"/>
+                <w:sz w:val="19"/>
+                <w:szCs w:val="19"/>
+              </w:rPr>
+              <w:t xml:space="preserve">High</w:t>
+            </w:r>
+          </w:p>
+        </w:tc>
+        <w:tc>
+          <w:tcPr>
+            <w:tcW w:type="dxa" w:w="4160"/>
+            <w:tcBorders>
+              <w:top w:val="single" w:color="ddd3c8" w:sz="1"/>
+              <w:left w:val="single" w:color="ddd3c8" w:sz="1"/>
+              <w:bottom w:val="single" w:color="ddd3c8" w:sz="1"/>
+              <w:right w:val="single" w:color="ddd3c8" w:sz="1"/>
+            </w:tcBorders>
+            <w:shd w:fill="FFFFFF" w:val="clear"/>
+            <w:tcMar>
+              <w:top w:type="dxa" w:w="80"/>
+              <w:left w:type="dxa" w:w="140"/>
+              <w:bottom w:type="dxa" w:w="80"/>
+              <w:right w:type="dxa" w:w="140"/>
+            </w:tcMar>
+          </w:tcPr>
+          <w:p>
+            <w:pPr>
+              <w:spacing w:before="0" w:after="0"/>
+              <w:jc w:val="left"/>
+            </w:pPr>
+            <w:r>
+              <w:rPr>
+                <w:rFonts w:ascii="Arial" w:cs="Arial" w:eastAsia="Arial" w:hAnsi="Arial"/>
+                <w:b/>
+                <w:bCs/>
+                <w:i w:val="false"/>
+                <w:iCs w:val="false"/>
+                <w:color w:val="3a2e3f"/>
+                <w:sz w:val="19"/>
+                <w:szCs w:val="19"/>
+              </w:rPr>
+              <w:t xml:space="preserve">Current model requires uploading the HTML file to Claude to add any resource. A quick-save input (title + URL + category) would let Michelle bookmark something found mid-session without a GitHub round-trip. Three persistence options explored: (1) localStorage — browser-specific, works offline, gone if browser data cleared; (2) Google Sheets as a lightweight backend — form on the page writes a new row via API, readable from any device, no new account needed; (3) Airtable — same pattern, slightly more structured, but adds a dependency. Notion also a candidate given its relevance to EdTech PM roles. Google Sheets is the lowest-friction starting point given existing Google ecosystem use.</w:t>
+            </w:r>
+          </w:p>
+        </w:tc>
+      </w:tr>
     </w:tbl>
     <w:p>
       <w:pPr>
@@ -8019,7 +8282,7 @@
           <w:sz w:val="22"/>
           <w:szCs w:val="22"/>
         </w:rPr>
-        <w:t xml:space="preserve">Cultivate (live demo): singletrackmom.github.io/AI_Resources_Hub.html</w:t>
+        <w:t xml:space="preserve">Cultivate (live demo): singletrackmom.github.io/index.html</w:t>
       </w:r>
     </w:p>
     <w:p>

</xml_diff>